<commit_message>
Added BARYCENTER to constants
</commit_message>
<xml_diff>
--- a/Geometry++_Документация.docx
+++ b/Geometry++_Документация.docx
@@ -3126,6 +3126,105 @@
           </w:p>
         </w:tc>
       </w:tr>
+      <w:tr>
+        <w:trPr>
+          <w:trHeight w:val="340"/>
+        </w:trPr>
+        <w:tc>
+          <w:tcPr>
+            <w:tcW w:w="1912" w:type="dxa"/>
+          </w:tcPr>
+          <w:p>
+            <w:pPr>
+              <w:spacing w:line="240" w:lineRule="auto"/>
+              <w:rPr>
+                <w:rFonts w:ascii="Consolas" w:hAnsi="Consolas"/>
+                <w:sz w:val="28"/>
+                <w:szCs w:val="28"/>
+              </w:rPr>
+            </w:pPr>
+            <w:r>
+              <w:rPr>
+                <w:rFonts w:ascii="Consolas" w:hAnsi="Consolas"/>
+                <w:sz w:val="28"/>
+                <w:szCs w:val="28"/>
+              </w:rPr>
+              <w:t>BARYCENTER</w:t>
+            </w:r>
+          </w:p>
+        </w:tc>
+        <w:tc>
+          <w:tcPr>
+            <w:tcW w:w="2199" w:type="dxa"/>
+          </w:tcPr>
+          <w:p>
+            <w:pPr>
+              <w:spacing w:line="240" w:lineRule="auto"/>
+              <w:rPr>
+                <w:rFonts w:ascii="Consolas" w:hAnsi="Consolas"/>
+                <w:sz w:val="28"/>
+                <w:szCs w:val="28"/>
+              </w:rPr>
+            </w:pPr>
+            <w:r>
+              <w:rPr>
+                <w:rFonts w:ascii="Consolas" w:hAnsi="Consolas"/>
+                <w:sz w:val="28"/>
+                <w:szCs w:val="28"/>
+              </w:rPr>
+              <w:t>BaryCoords</w:t>
+            </w:r>
+          </w:p>
+        </w:tc>
+        <w:tc>
+          <w:tcPr>
+            <w:tcW w:w="3119" w:type="dxa"/>
+          </w:tcPr>
+          <w:p>
+            <w:pPr>
+              <w:spacing w:line="240" w:lineRule="auto"/>
+              <w:rPr>
+                <w:rFonts w:ascii="Consolas" w:hAnsi="Consolas"/>
+                <w:sz w:val="28"/>
+                <w:szCs w:val="28"/>
+              </w:rPr>
+            </w:pPr>
+            <w:r>
+              <w:rPr>
+                <w:rFonts w:ascii="Consolas" w:hAnsi="Consolas"/>
+                <w:sz w:val="28"/>
+                <w:szCs w:val="28"/>
+              </w:rPr>
+              <w:t>{1/3, 1/3, 1/3}</w:t>
+            </w:r>
+          </w:p>
+        </w:tc>
+        <w:tc>
+          <w:tcPr>
+            <w:tcW w:w="2977" w:type="dxa"/>
+          </w:tcPr>
+          <w:p>
+            <w:pPr>
+              <w:spacing w:line="240" w:lineRule="auto"/>
+              <w:rPr>
+                <w:rFonts w:ascii="Cambria" w:hAnsi="Cambria"/>
+                <w:sz w:val="28"/>
+                <w:szCs w:val="28"/>
+                <w:lang w:val="ru-RU"/>
+              </w:rPr>
+            </w:pPr>
+            <w:r>
+              <w:rPr>
+                <w:rFonts w:ascii="Cambria" w:hAnsi="Cambria"/>
+                <w:sz w:val="28"/>
+                <w:szCs w:val="28"/>
+                <w:lang w:val="ru-RU"/>
+              </w:rPr>
+              <w:t xml:space="preserve">Барицентр </w:t>
+            </w:r>
+          </w:p>
+        </w:tc>
+      </w:tr>
     </w:tbl>
     <w:p>
       <w:pPr>
@@ -3728,7 +3827,7 @@
     </w:tbl>
     <w:p>
       <w:pPr>
-        <w:jc w:val="right"/>
+        <w:spacing w:after="160" w:line="259" w:lineRule="auto"/>
         <w:rPr>
           <w:rFonts w:ascii="Cambria" w:hAnsi="Cambria"/>
           <w:sz w:val="28"/>
@@ -3740,134 +3839,13 @@
     <w:p>
       <w:pPr>
         <w:spacing w:after="160" w:line="259" w:lineRule="auto"/>
-        <w:jc w:val="right"/>
-        <w:rPr>
-          <w:rFonts w:ascii="Cambria" w:hAnsi="Cambria"/>
-          <w:b/>
-          <w:bCs/>
-          <w:sz w:val="28"/>
-          <w:szCs w:val="28"/>
-          <w:lang w:val="ru-RU"/>
-        </w:rPr>
-      </w:pPr>
-      <w:r>
-        <w:rPr>
-          <w:rFonts w:ascii="Cambria" w:hAnsi="Cambria"/>
-          <w:b/>
-          <w:bCs/>
-          <w:sz w:val="28"/>
-          <w:szCs w:val="28"/>
-          <w:lang w:val="ru-RU"/>
-        </w:rPr>
-        <w:t>Важное примечание!</w:t>
-      </w:r>
-    </w:p>
-    <w:p>
-      <w:pPr>
-        <w:spacing w:after="160" w:line="259" w:lineRule="auto"/>
-        <w:jc w:val="right"/>
-        <w:rPr>
-          <w:rFonts w:ascii="Cambria" w:hAnsi="Cambria"/>
-          <w:sz w:val="28"/>
-          <w:szCs w:val="28"/>
-          <w:lang w:val="ru-RU"/>
-        </w:rPr>
-      </w:pPr>
-      <w:r>
-        <w:rPr>
-          <w:rFonts w:ascii="Cambria" w:hAnsi="Cambria"/>
-          <w:sz w:val="28"/>
-          <w:szCs w:val="28"/>
-          <w:lang w:val="ru-RU"/>
-        </w:rPr>
-        <w:t xml:space="preserve">Программа работает только с радианами, </w:t>
-      </w:r>
-      <w:r>
-        <w:rPr>
-          <w:rFonts w:ascii="Consolas" w:hAnsi="Consolas"/>
-          <w:sz w:val="28"/>
-          <w:szCs w:val="28"/>
-        </w:rPr>
-        <w:t>r</w:t>
-      </w:r>
-      <w:r>
-        <w:rPr>
-          <w:rFonts w:ascii="Consolas" w:hAnsi="Consolas"/>
-          <w:sz w:val="28"/>
-          <w:szCs w:val="28"/>
-          <w:lang w:val="ru-RU"/>
-        </w:rPr>
-        <w:t>2</w:t>
-      </w:r>
-      <w:r>
-        <w:rPr>
-          <w:rFonts w:ascii="Consolas" w:hAnsi="Consolas"/>
-          <w:sz w:val="28"/>
-          <w:szCs w:val="28"/>
-        </w:rPr>
-        <w:t>d</w:t>
-      </w:r>
-      <w:r>
-        <w:rPr>
-          <w:rFonts w:ascii="Consolas" w:hAnsi="Consolas"/>
-          <w:sz w:val="28"/>
-          <w:szCs w:val="28"/>
-          <w:lang w:val="ru-RU"/>
-        </w:rPr>
-        <w:t>(</w:t>
-      </w:r>
-      <w:r>
-        <w:rPr>
-          <w:rFonts w:ascii="Consolas" w:hAnsi="Consolas"/>
-          <w:sz w:val="28"/>
-          <w:szCs w:val="28"/>
-        </w:rPr>
-        <w:t>double</w:t>
-      </w:r>
-      <w:r>
-        <w:rPr>
-          <w:rFonts w:ascii="Consolas" w:hAnsi="Consolas"/>
-          <w:sz w:val="28"/>
-          <w:szCs w:val="28"/>
-          <w:lang w:val="ru-RU"/>
-        </w:rPr>
-        <w:t xml:space="preserve"> </w:t>
-      </w:r>
-      <w:r>
-        <w:rPr>
-          <w:rFonts w:ascii="Consolas" w:hAnsi="Consolas"/>
-          <w:sz w:val="28"/>
-          <w:szCs w:val="28"/>
-        </w:rPr>
-        <w:t>radians</w:t>
-      </w:r>
-      <w:r>
-        <w:rPr>
-          <w:rFonts w:ascii="Consolas" w:hAnsi="Consolas"/>
-          <w:sz w:val="28"/>
-          <w:szCs w:val="28"/>
-          <w:lang w:val="ru-RU"/>
-        </w:rPr>
-        <w:t>)</w:t>
-      </w:r>
-      <w:r>
-        <w:rPr>
-          <w:rFonts w:ascii="Cambria" w:hAnsi="Cambria"/>
-          <w:sz w:val="28"/>
-          <w:szCs w:val="28"/>
-          <w:lang w:val="ru-RU"/>
-        </w:rPr>
-        <w:t xml:space="preserve"> создано только для удобства</w:t>
-      </w:r>
-      <w:r>
-        <w:rPr>
-          <w:rFonts w:ascii="Cambria" w:hAnsi="Cambria"/>
-          <w:sz w:val="28"/>
-          <w:szCs w:val="28"/>
-          <w:lang w:val="ru-RU"/>
-        </w:rPr>
-        <w:t xml:space="preserve"> вывода и тому подобного</w:t>
-      </w:r>
+        <w:rPr>
+          <w:rFonts w:ascii="Cambria" w:hAnsi="Cambria"/>
+          <w:sz w:val="28"/>
+          <w:szCs w:val="28"/>
+          <w:lang w:val="ru-RU"/>
+        </w:rPr>
+      </w:pPr>
     </w:p>
     <w:p>
       <w:pPr>

</xml_diff>